<commit_message>
chore : ajout du fichier .gitkeep
</commit_message>
<xml_diff>
--- a/01_docs/XX_EP_Journal_de_Bord.docx
+++ b/01_docs/XX_EP_Journal_de_Bord.docx
@@ -170,16 +170,82 @@
       <w:r>
         <w:t>Lisible et simple</w:t>
       </w:r>
+    </w:p>
+    <w:p>
+      <w:pPr>
+        <w:pStyle w:val="Titre1"/>
+      </w:pPr>
+      <w:r>
+        <w:t>Sprint 1 : Initialisation</w:t>
+      </w:r>
+      <w:r>
+        <w:t xml:space="preserve"> du projet </w:t>
+      </w:r>
+    </w:p>
+    <w:p>
+      <w:r>
+        <w:t xml:space="preserve">Création de l’arborescence : docs, </w:t>
+      </w:r>
+      <w:proofErr w:type="spellStart"/>
+      <w:r>
+        <w:t>asset</w:t>
+      </w:r>
+      <w:proofErr w:type="spellEnd"/>
+      <w:r>
+        <w:t xml:space="preserve">, </w:t>
+      </w:r>
+      <w:proofErr w:type="spellStart"/>
+      <w:r>
+        <w:t>includes</w:t>
+      </w:r>
+      <w:proofErr w:type="spellEnd"/>
+      <w:r>
+        <w:t xml:space="preserve">, pages, </w:t>
+      </w:r>
+      <w:proofErr w:type="spellStart"/>
+      <w:r>
+        <w:t>sql</w:t>
+      </w:r>
+      <w:proofErr w:type="spellEnd"/>
+      <w:r>
+        <w:t xml:space="preserve">, </w:t>
+      </w:r>
+      <w:proofErr w:type="spellStart"/>
+      <w:r>
+        <w:t>uploads</w:t>
+      </w:r>
+      <w:proofErr w:type="spellEnd"/>
+      <w:r>
+        <w:t xml:space="preserve"> + readme.md</w:t>
+      </w:r>
+    </w:p>
+    <w:p>
+      <w:r>
+        <w:t xml:space="preserve">03/07/26 : Git ne prend pas en compte les dossiers vides lors du </w:t>
+      </w:r>
+      <w:proofErr w:type="spellStart"/>
+      <w:r>
+        <w:t>commits</w:t>
+      </w:r>
+      <w:proofErr w:type="spellEnd"/>
+      <w:r>
+        <w:t xml:space="preserve">. Il faut soit créer un fichier vierge soit créer un fichier </w:t>
+      </w:r>
+      <w:proofErr w:type="gramStart"/>
+      <w:r>
+        <w:t>« .</w:t>
+      </w:r>
+      <w:proofErr w:type="spellStart"/>
+      <w:r>
+        <w:t>gitkeep</w:t>
+      </w:r>
+      <w:proofErr w:type="spellEnd"/>
+      <w:proofErr w:type="gramEnd"/>
+      <w:r>
+        <w:t> »</w:t>
+      </w:r>
       <w:bookmarkStart w:id="0" w:name="_GoBack"/>
       <w:bookmarkEnd w:id="0"/>
-    </w:p>
-    <w:p>
-      <w:pPr>
-        <w:pStyle w:val="Titre1"/>
-      </w:pPr>
-      <w:r>
-        <w:t>Sprint 1 : Initialisation</w:t>
-      </w:r>
     </w:p>
     <w:sectPr>
       <w:pgSz w:w="11906" w:h="16838"/>

</xml_diff>